<commit_message>
docs: User Document 0.1 with the classification explainer; SMD 0.3 points at it
New docs/handover/user-document.md (+ .docx, .pdf, build script): Chapters
1-4 carry the 'From SILOs to Priority Groups' explainer as document
content, not a link: the clustering flow with the six-step worked example
on the 3-subject fixture, the classification flow, the seven thresholds,
and one real student per priority group from the 5000-student run with
their profile plots. Chapter 5 (page-by-page walkthrough) is outlined and
marked TO FILL. Figures 11-13 rendered from the explainer into
docs/handover/diagrams/.

SMD: companion-document row and Appendix B intro now point at the User
Document for the reasoning; version 0.3; docx and pdf rebuilt.

Co-Authored-By: Claude Fable 5.1 <noreply@anthropic.com>
</commit_message>
<xml_diff>
--- a/docs/handover/system-maintenance-document.docx
+++ b/docs/handover/system-maintenance-document.docx
@@ -73,7 +73,7 @@
               <w:jc w:val="left"/>
             </w:pPr>
             <w:r>
-              <w:t xml:space="preserve">DRAFT 0.2 — for team review. Sections marked ⚠</w:t>
+              <w:t xml:space="preserve">DRAFT 0.3 — for team review. Sections marked ⚠</w:t>
             </w:r>
             <w:r>
               <w:t xml:space="preserve"> </w:t>
@@ -338,7 +338,16 @@
               <w:t xml:space="preserve"> </w:t>
             </w:r>
             <w:r>
-              <w:t xml:space="preserve">(quick start), the User Document (end-user walkthrough of the dashboard and CLI), the two ADRs under</w:t>
+              <w:t xml:space="preserve">(quick start), the User Document (</w:t>
+            </w:r>
+            <w:r>
+              <w:rPr>
+                <w:rStyle w:val="VerbatimChar"/>
+              </w:rPr>
+              <w:t xml:space="preserve">docs/handover/user-document.md</w:t>
+            </w:r>
+            <w:r>
+              <w:t xml:space="preserve">: how the numbers are made, with worked examples, and the dashboard walkthrough), the two ADRs under</w:t>
             </w:r>
             <w:r>
               <w:t xml:space="preserve"> </w:t>
@@ -24563,6 +24572,24 @@
     <w:p>
       <w:pPr>
         <w:pStyle w:val="FirstParagraph"/>
+      </w:pPr>
+      <w:r>
+        <w:rPr>
+          <w:bCs/>
+          <w:b/>
+        </w:rPr>
+        <w:t xml:space="preserve">For the reasoning behind these rules,</w:t>
+      </w:r>
+      <w:r>
+        <w:t xml:space="preserve"> </w:t>
+      </w:r>
+      <w:r>
+        <w:t xml:space="preserve">with flowcharts and one worked student per priority group, see the User Document, Chapters 2 to 4. This appendix is the formal definition; that document is the explanation.</w:t>
+      </w:r>
+    </w:p>
+    <w:p>
+      <w:pPr>
+        <w:pStyle w:val="BodyText"/>
       </w:pPr>
       <w:r>
         <w:rPr>
@@ -31494,6 +31521,56 @@
             </w:pPr>
             <w:r>
               <w:t xml:space="preserve">Added Appendix B, Metrics reference; former Appendices B and C are now C and D. Added Figure 5b and the pointer to the learning-plan traceability document.</w:t>
+            </w:r>
+          </w:p>
+        </w:tc>
+      </w:tr>
+      <w:tr>
+        <w:tc>
+          <w:tcPr/>
+          <w:p>
+            <w:pPr>
+              <w:pStyle w:val="Compact"/>
+              <w:jc w:val="left"/>
+            </w:pPr>
+            <w:r>
+              <w:t xml:space="preserve">0.3</w:t>
+            </w:r>
+          </w:p>
+        </w:tc>
+        <w:tc>
+          <w:tcPr/>
+          <w:p>
+            <w:pPr>
+              <w:pStyle w:val="Compact"/>
+              <w:jc w:val="left"/>
+            </w:pPr>
+            <w:r>
+              <w:t xml:space="preserve">29 Sep 2026</w:t>
+            </w:r>
+          </w:p>
+        </w:tc>
+        <w:tc>
+          <w:tcPr/>
+          <w:p>
+            <w:pPr>
+              <w:pStyle w:val="Compact"/>
+              <w:jc w:val="left"/>
+            </w:pPr>
+            <w:r>
+              <w:t xml:space="preserve">Allan Campton (drafted with Claude Code)</w:t>
+            </w:r>
+          </w:p>
+        </w:tc>
+        <w:tc>
+          <w:tcPr/>
+          <w:p>
+            <w:pPr>
+              <w:pStyle w:val="Compact"/>
+              <w:jc w:val="left"/>
+            </w:pPr>
+            <w:r>
+              <w:t xml:space="preserve">Companion-document row and Appendix B now point at the User Document, which holds the explanation and worked examples behind the classification rules.</w:t>
             </w:r>
           </w:p>
         </w:tc>

</xml_diff>

<commit_message>
IOLG-106: SMD Figure 5c, unfiltered-ahead finding, and the last Provenance renames
The two previous document commits each stopped short because the edit
script aborted before writing; this one carries the SMD section 3.11
figure and finding, the section 8.2 follow-up order, and the remaining
page-name replacements in the User Document.

Co-Authored-By: Claude Fable 5.1 <noreply@anthropic.com>
</commit_message>
<xml_diff>
--- a/docs/handover/system-maintenance-document.docx
+++ b/docs/handover/system-maintenance-document.docx
@@ -28,7 +28,7 @@
         </w:p>
       </w:sdtContent>
     </w:sdt>
-    <w:bookmarkStart w:id="105" w:name="X360fa8bb0e8f6d1283c3e1214c3bc90f5bd9c66"/>
+    <w:bookmarkStart w:id="108" w:name="X360fa8bb0e8f6d1283c3e1214c3bc90f5bd9c66"/>
     <w:p>
       <w:pPr>
         <w:pStyle w:val="Heading1"/>
@@ -3772,7 +3772,7 @@
       </w:r>
     </w:p>
     <w:bookmarkEnd w:id="25"/>
-    <w:bookmarkStart w:id="58" w:name="design-and-implementation"/>
+    <w:bookmarkStart w:id="61" w:name="design-and-implementation"/>
     <w:p>
       <w:pPr>
         <w:pStyle w:val="Heading2"/>
@@ -11921,7 +11921,7 @@
       </w:r>
     </w:p>
     <w:bookmarkEnd w:id="56"/>
-    <w:bookmarkStart w:id="57" w:name="X3ab99d062148d37864863aae600335a63fa2733"/>
+    <w:bookmarkStart w:id="60" w:name="X3ab99d062148d37864863aae600335a63fa2733"/>
     <w:p>
       <w:pPr>
         <w:pStyle w:val="Heading3"/>
@@ -12523,38 +12523,57 @@
     </w:p>
     <w:p>
       <w:pPr>
-        <w:pStyle w:val="BodyText"/>
+        <w:pStyle w:val="CaptionedFigure"/>
       </w:pPr>
       <w:r>
-        <w:rPr>
-          <w:bCs/>
-          <w:b/>
-        </w:rPr>
-        <w:t xml:space="preserve">Not a prediction.</w:t>
-      </w:r>
-      <w:r>
-        <w:t xml:space="preserve"> </w:t>
-      </w:r>
-      <w:r>
-        <w:t xml:space="preserve">With two or three points per competency the trajectory is an ordering, not a slope, and nothing extrapolates. The subjects ahead are where the competency is assessed next, which is the moment to prepare; they are never advice about what to enrol in (D19). Enrolment data from Moodle would make</w:t>
-      </w:r>
-      <w:r>
-        <w:t xml:space="preserve"> </w:t>
-      </w:r>
-      <w:r>
-        <w:t xml:space="preserve">“</w:t>
-      </w:r>
-      <w:r>
-        <w:t xml:space="preserve">ahead</w:t>
-      </w:r>
-      <w:r>
-        <w:t xml:space="preserve">”</w:t>
-      </w:r>
-      <w:r>
-        <w:t xml:space="preserve"> </w:t>
-      </w:r>
-      <w:r>
-        <w:t xml:space="preserve">a fact rather than an inference from the program; that is a loader extension, not built.</w:t>
+        <w:drawing>
+          <wp:inline>
+            <wp:extent cx="5334000" cy="2607733"/>
+            <wp:effectExtent b="0" l="0" r="0" t="0"/>
+            <wp:docPr descr="A trajectory: STU0834 in Expressing mathematical arguments" title="" id="58" name="Picture"/>
+            <a:graphic>
+              <a:graphicData uri="http://schemas.openxmlformats.org/drawingml/2006/picture">
+                <pic:pic>
+                  <pic:nvPicPr>
+                    <pic:cNvPr descr="diagrams/15-trajectory-STU0834.png" id="59" name="Picture"/>
+                    <pic:cNvPicPr>
+                      <a:picLocks noChangeArrowheads="1" noChangeAspect="1"/>
+                    </pic:cNvPicPr>
+                  </pic:nvPicPr>
+                  <pic:blipFill>
+                    <a:blip r:embed="rId57"/>
+                    <a:stretch>
+                      <a:fillRect/>
+                    </a:stretch>
+                  </pic:blipFill>
+                  <pic:spPr bwMode="auto">
+                    <a:xfrm>
+                      <a:off x="0" y="0"/>
+                      <a:ext cx="5334000" cy="2607733"/>
+                    </a:xfrm>
+                    <a:prstGeom prst="rect">
+                      <a:avLst/>
+                    </a:prstGeom>
+                    <a:noFill/>
+                    <a:ln w="9525">
+                      <a:noFill/>
+                      <a:headEnd/>
+                      <a:tailEnd/>
+                    </a:ln>
+                  </pic:spPr>
+                </pic:pic>
+              </a:graphicData>
+            </a:graphic>
+          </wp:inline>
+        </w:drawing>
+      </w:r>
+    </w:p>
+    <w:p>
+      <w:pPr>
+        <w:pStyle w:val="ImageCaption"/>
+      </w:pPr>
+      <w:r>
+        <w:t xml:space="preserve">A trajectory: STU0834 in Expressing mathematical arguments</w:t>
       </w:r>
     </w:p>
     <w:p>
@@ -12562,6 +12581,105 @@
         <w:pStyle w:val="BodyText"/>
       </w:pPr>
       <w:r>
+        <w:rPr>
+          <w:iCs/>
+          <w:i/>
+        </w:rPr>
+        <w:t xml:space="preserve">Figure 5c: One trajectory from the 100-subject cohort, drawn for the User Document (its §4.5 explains it for readers of the dashboard). Four first-year subjects sat and declining, two second-year subjects ahead, ordered by year digit because the default declared sequence covers only the three supplied subjects.</w:t>
+      </w:r>
+    </w:p>
+    <w:p>
+      <w:pPr>
+        <w:pStyle w:val="BodyText"/>
+      </w:pPr>
+      <w:r>
+        <w:rPr>
+          <w:bCs/>
+          <w:b/>
+        </w:rPr>
+        <w:t xml:space="preserve">Ahead is unfiltered without a course map.</w:t>
+      </w:r>
+      <w:r>
+        <w:t xml:space="preserve"> </w:t>
+      </w:r>
+      <w:r>
+        <w:t xml:space="preserve">On the three-subject workbook</w:t>
+      </w:r>
+      <w:r>
+        <w:t xml:space="preserve"> </w:t>
+      </w:r>
+      <w:r>
+        <w:t xml:space="preserve">“</w:t>
+      </w:r>
+      <w:r>
+        <w:t xml:space="preserve">ahead</w:t>
+      </w:r>
+      <w:r>
+        <w:t xml:space="preserve">”</w:t>
+      </w:r>
+      <w:r>
+        <w:t xml:space="preserve"> </w:t>
+      </w:r>
+      <w:r>
+        <w:t xml:space="preserve">is exact. On the 100-subject cohort a competency can span fifteen subjects across seven programs, so a student’s chain lists subjects from degrees they are not in, and a skipped earlier-year subject appears as ahead. The chain is correct about where the competency is assessed and wrong as a list of the student’s next subjects; filtering it needs the program, which the catalogue’s</w:t>
+      </w:r>
+      <w:r>
+        <w:t xml:space="preserve"> </w:t>
+      </w:r>
+      <w:r>
+        <w:rPr>
+          <w:rStyle w:val="VerbatimChar"/>
+        </w:rPr>
+        <w:t xml:space="preserve">programs:</w:t>
+      </w:r>
+      <w:r>
+        <w:t xml:space="preserve"> </w:t>
+      </w:r>
+      <w:r>
+        <w:t xml:space="preserve">block and the Student Summary’s Program column both carry but the loader does not yet read. That is the first follow-up (§8.2).</w:t>
+      </w:r>
+    </w:p>
+    <w:p>
+      <w:pPr>
+        <w:pStyle w:val="BodyText"/>
+      </w:pPr>
+      <w:r>
+        <w:rPr>
+          <w:bCs/>
+          <w:b/>
+        </w:rPr>
+        <w:t xml:space="preserve">Not a prediction.</w:t>
+      </w:r>
+      <w:r>
+        <w:t xml:space="preserve"> </w:t>
+      </w:r>
+      <w:r>
+        <w:t xml:space="preserve">With two or three points per competency the trajectory is an ordering, not a slope, and nothing extrapolates. The subjects ahead are where the competency is assessed next, which is the moment to prepare; they are never advice about what to enrol in (D19). Enrolment data from Moodle would make</w:t>
+      </w:r>
+      <w:r>
+        <w:t xml:space="preserve"> </w:t>
+      </w:r>
+      <w:r>
+        <w:t xml:space="preserve">“</w:t>
+      </w:r>
+      <w:r>
+        <w:t xml:space="preserve">ahead</w:t>
+      </w:r>
+      <w:r>
+        <w:t xml:space="preserve">”</w:t>
+      </w:r>
+      <w:r>
+        <w:t xml:space="preserve"> </w:t>
+      </w:r>
+      <w:r>
+        <w:t xml:space="preserve">a fact rather than an inference from the program; that is a loader extension, not built.</w:t>
+      </w:r>
+    </w:p>
+    <w:p>
+      <w:pPr>
+        <w:pStyle w:val="BodyText"/>
+      </w:pPr>
+      <w:r>
         <w:t xml:space="preserve">Tests:</w:t>
       </w:r>
       <w:r>
@@ -12629,9 +12747,9 @@
         </w:pict>
       </w:r>
     </w:p>
-    <w:bookmarkEnd w:id="57"/>
-    <w:bookmarkEnd w:id="58"/>
-    <w:bookmarkStart w:id="65" w:name="deployment-and-environment"/>
+    <w:bookmarkEnd w:id="60"/>
+    <w:bookmarkEnd w:id="61"/>
+    <w:bookmarkStart w:id="68" w:name="deployment-and-environment"/>
     <w:p>
       <w:pPr>
         <w:pStyle w:val="Heading2"/>
@@ -12640,7 +12758,7 @@
         <w:t xml:space="preserve">4. Deployment and environment</w:t>
       </w:r>
     </w:p>
-    <w:bookmarkStart w:id="59" w:name="hardware-requirements"/>
+    <w:bookmarkStart w:id="62" w:name="hardware-requirements"/>
     <w:p>
       <w:pPr>
         <w:pStyle w:val="Heading3"/>
@@ -12894,8 +13012,8 @@
         </w:tc>
       </w:tr>
     </w:tbl>
-    <w:bookmarkEnd w:id="59"/>
-    <w:bookmarkStart w:id="60" w:name="software-requirements"/>
+    <w:bookmarkEnd w:id="62"/>
+    <w:bookmarkStart w:id="63" w:name="software-requirements"/>
     <w:p>
       <w:pPr>
         <w:pStyle w:val="Heading3"/>
@@ -13321,8 +13439,8 @@
         </w:tc>
       </w:tr>
     </w:tbl>
-    <w:bookmarkEnd w:id="60"/>
-    <w:bookmarkStart w:id="61" w:name="installation-from-a-clean-clone-linux"/>
+    <w:bookmarkEnd w:id="63"/>
+    <w:bookmarkStart w:id="64" w:name="installation-from-a-clean-clone-linux"/>
     <w:p>
       <w:pPr>
         <w:pStyle w:val="Heading3"/>
@@ -14610,8 +14728,8 @@
         <w:t xml:space="preserve">A five-minute recording of steps 1–8 above on a fresh VM is planned for Sprint 6 (Anup’s clean-rebuild task is the natural moment to capture it). Link it here.</w:t>
       </w:r>
     </w:p>
-    <w:bookmarkEnd w:id="61"/>
-    <w:bookmarkStart w:id="62" w:name="configuration-reference"/>
+    <w:bookmarkEnd w:id="64"/>
+    <w:bookmarkStart w:id="65" w:name="configuration-reference"/>
     <w:p>
       <w:pPr>
         <w:pStyle w:val="Heading3"/>
@@ -16295,8 +16413,8 @@
         </w:tc>
       </w:tr>
     </w:tbl>
-    <w:bookmarkEnd w:id="62"/>
-    <w:bookmarkStart w:id="63" w:name="command-reference"/>
+    <w:bookmarkEnd w:id="65"/>
+    <w:bookmarkStart w:id="66" w:name="command-reference"/>
     <w:p>
       <w:pPr>
         <w:pStyle w:val="Heading3"/>
@@ -17812,8 +17930,8 @@
         </w:tc>
       </w:tr>
     </w:tbl>
-    <w:bookmarkEnd w:id="63"/>
-    <w:bookmarkStart w:id="64" w:name="verifying-an-installation"/>
+    <w:bookmarkEnd w:id="66"/>
+    <w:bookmarkStart w:id="67" w:name="verifying-an-installation"/>
     <w:p>
       <w:pPr>
         <w:pStyle w:val="Heading3"/>
@@ -18308,9 +18426,9 @@
         </w:pict>
       </w:r>
     </w:p>
-    <w:bookmarkEnd w:id="64"/>
-    <w:bookmarkEnd w:id="65"/>
-    <w:bookmarkStart w:id="75" w:name="ongoing-maintenance"/>
+    <w:bookmarkEnd w:id="67"/>
+    <w:bookmarkEnd w:id="68"/>
+    <w:bookmarkStart w:id="78" w:name="ongoing-maintenance"/>
     <w:p>
       <w:pPr>
         <w:pStyle w:val="Heading2"/>
@@ -18319,7 +18437,7 @@
         <w:t xml:space="preserve">5. Ongoing maintenance</w:t>
       </w:r>
     </w:p>
-    <w:bookmarkStart w:id="66" w:name="repository-map-where-to-change-what"/>
+    <w:bookmarkStart w:id="69" w:name="repository-map-where-to-change-what"/>
     <w:p>
       <w:pPr>
         <w:pStyle w:val="Heading3"/>
@@ -18873,8 +18991,8 @@
         <w:t xml:space="preserve">and a list page that a test proves agree. Every one of these has an existing example to copy.</w:t>
       </w:r>
     </w:p>
-    <w:bookmarkEnd w:id="66"/>
-    <w:bookmarkStart w:id="67" w:name="routine-operations"/>
+    <w:bookmarkEnd w:id="69"/>
+    <w:bookmarkStart w:id="70" w:name="routine-operations"/>
     <w:p>
       <w:pPr>
         <w:pStyle w:val="Heading3"/>
@@ -19624,8 +19742,8 @@
         </w:tc>
       </w:tr>
     </w:tbl>
-    <w:bookmarkEnd w:id="67"/>
-    <w:bookmarkStart w:id="68" w:name="keeping-the-dependencies-current"/>
+    <w:bookmarkEnd w:id="70"/>
+    <w:bookmarkStart w:id="71" w:name="keeping-the-dependencies-current"/>
     <w:p>
       <w:pPr>
         <w:pStyle w:val="Heading3"/>
@@ -19901,8 +20019,8 @@
         <w:t xml:space="preserve">3 are the likely friction points.</w:t>
       </w:r>
     </w:p>
-    <w:bookmarkEnd w:id="68"/>
-    <w:bookmarkStart w:id="69" w:name="ci-and-branch-protection"/>
+    <w:bookmarkEnd w:id="71"/>
+    <w:bookmarkStart w:id="72" w:name="ci-and-branch-protection"/>
     <w:p>
       <w:pPr>
         <w:pStyle w:val="Heading3"/>
@@ -20193,8 +20311,8 @@
         <w:t xml:space="preserve">To change protection rules you need repository admin; the settings and the reason for each are recorded in action A-03.</w:t>
       </w:r>
     </w:p>
-    <w:bookmarkEnd w:id="69"/>
-    <w:bookmarkStart w:id="70" w:name="extending-the-system"/>
+    <w:bookmarkEnd w:id="72"/>
+    <w:bookmarkStart w:id="73" w:name="extending-the-system"/>
     <w:p>
       <w:pPr>
         <w:pStyle w:val="Heading3"/>
@@ -20980,8 +21098,8 @@
         <w:t xml:space="preserve">scores pairwise precision/recall of any clustering against the catalogue’s competency tags.</w:t>
       </w:r>
     </w:p>
-    <w:bookmarkEnd w:id="70"/>
-    <w:bookmarkStart w:id="71" w:name="troubleshooting"/>
+    <w:bookmarkEnd w:id="73"/>
+    <w:bookmarkStart w:id="74" w:name="troubleshooting"/>
     <w:p>
       <w:pPr>
         <w:pStyle w:val="Heading3"/>
@@ -22368,8 +22486,8 @@
         </w:tc>
       </w:tr>
     </w:tbl>
-    <w:bookmarkEnd w:id="71"/>
-    <w:bookmarkStart w:id="72" w:name="technical-debt-register"/>
+    <w:bookmarkEnd w:id="74"/>
+    <w:bookmarkStart w:id="75" w:name="technical-debt-register"/>
     <w:p>
       <w:pPr>
         <w:pStyle w:val="Heading3"/>
@@ -24047,8 +24165,8 @@
         </w:tc>
       </w:tr>
     </w:tbl>
-    <w:bookmarkEnd w:id="72"/>
-    <w:bookmarkStart w:id="73" w:name="Xa66ef4d0f6c055af686f168947d88cb0a1aaf15"/>
+    <w:bookmarkEnd w:id="75"/>
+    <w:bookmarkStart w:id="76" w:name="Xa66ef4d0f6c055af686f168947d88cb0a1aaf15"/>
     <w:p>
       <w:pPr>
         <w:pStyle w:val="Heading3"/>
@@ -24523,8 +24641,8 @@
         <w:t xml:space="preserve">are used only for discovery and the connectivity probe, with a four-function token on a dedicated service account. Do not generate an admin token.</w:t>
       </w:r>
     </w:p>
-    <w:bookmarkEnd w:id="73"/>
-    <w:bookmarkStart w:id="74" w:name="documentation-that-is-known-to-be-stale"/>
+    <w:bookmarkEnd w:id="76"/>
+    <w:bookmarkStart w:id="77" w:name="documentation-that-is-known-to-be-stale"/>
     <w:p>
       <w:pPr>
         <w:pStyle w:val="Heading3"/>
@@ -24755,9 +24873,9 @@
         </w:pict>
       </w:r>
     </w:p>
-    <w:bookmarkEnd w:id="74"/>
-    <w:bookmarkEnd w:id="75"/>
-    <w:bookmarkStart w:id="81" w:name="testing"/>
+    <w:bookmarkEnd w:id="77"/>
+    <w:bookmarkEnd w:id="78"/>
+    <w:bookmarkStart w:id="84" w:name="testing"/>
     <w:p>
       <w:pPr>
         <w:pStyle w:val="Heading2"/>
@@ -24766,7 +24884,7 @@
         <w:t xml:space="preserve">6. Testing</w:t>
       </w:r>
     </w:p>
-    <w:bookmarkStart w:id="76" w:name="strategy"/>
+    <w:bookmarkStart w:id="79" w:name="strategy"/>
     <w:p>
       <w:pPr>
         <w:pStyle w:val="Heading3"/>
@@ -25689,8 +25807,8 @@
         <w:t xml:space="preserve">have no direct tests.</w:t>
       </w:r>
     </w:p>
-    <w:bookmarkEnd w:id="76"/>
-    <w:bookmarkStart w:id="77" w:name="user-story-test-table"/>
+    <w:bookmarkEnd w:id="79"/>
+    <w:bookmarkStart w:id="80" w:name="user-story-test-table"/>
     <w:p>
       <w:pPr>
         <w:pStyle w:val="Heading3"/>
@@ -28347,8 +28465,8 @@
         </w:tc>
       </w:tr>
     </w:tbl>
-    <w:bookmarkEnd w:id="77"/>
-    <w:bookmarkStart w:id="78" w:name="running-the-tests"/>
+    <w:bookmarkEnd w:id="80"/>
+    <w:bookmarkStart w:id="81" w:name="running-the-tests"/>
     <w:p>
       <w:pPr>
         <w:pStyle w:val="Heading3"/>
@@ -28631,8 +28749,8 @@
         <w:t xml:space="preserve">, no custom markers and no pytest config section; the suite is deliberately plain.</w:t>
       </w:r>
     </w:p>
-    <w:bookmarkEnd w:id="78"/>
-    <w:bookmarkStart w:id="79" w:name="continuous-integration"/>
+    <w:bookmarkEnd w:id="81"/>
+    <w:bookmarkStart w:id="82" w:name="continuous-integration"/>
     <w:p>
       <w:pPr>
         <w:pStyle w:val="Heading3"/>
@@ -28667,8 +28785,8 @@
         <w:t xml:space="preserve">is still found; a full-history scan was confirmed clean on 24 Aug 2026 and the job’s value is that it stays that way. Coverage XML is uploaded as an artifact on every run, including failed ones.</w:t>
       </w:r>
     </w:p>
-    <w:bookmarkEnd w:id="79"/>
-    <w:bookmarkStart w:id="80" w:name="Xdcb452c337cb38a77f57c4c85c3bc7a7f473fb0"/>
+    <w:bookmarkEnd w:id="82"/>
+    <w:bookmarkStart w:id="83" w:name="Xdcb452c337cb38a77f57c4c85c3bc7a7f473fb0"/>
     <w:p>
       <w:pPr>
         <w:pStyle w:val="Heading3"/>
@@ -29690,9 +29808,9 @@
         </w:pict>
       </w:r>
     </w:p>
-    <w:bookmarkEnd w:id="80"/>
-    <w:bookmarkEnd w:id="81"/>
-    <w:bookmarkStart w:id="87" w:name="usability-trial-results"/>
+    <w:bookmarkEnd w:id="83"/>
+    <w:bookmarkEnd w:id="84"/>
+    <w:bookmarkStart w:id="90" w:name="usability-trial-results"/>
     <w:p>
       <w:pPr>
         <w:pStyle w:val="Heading2"/>
@@ -29725,7 +29843,7 @@
         <w:t xml:space="preserve">The trial is scheduled as part of the Sprint 5 review on 4/5 October 2026. This section sets out who will test, what they will do, what is already known from owner feedback and from the team’s own preliminary runs, and the table to fill. It is framed as the project owner’s roadmap because that is what the results are for.</w:t>
       </w:r>
     </w:p>
-    <w:bookmarkStart w:id="82" w:name="participants-and-method"/>
+    <w:bookmarkStart w:id="85" w:name="participants-and-method"/>
     <w:p>
       <w:pPr>
         <w:pStyle w:val="Heading3"/>
@@ -29978,8 +30096,8 @@
         <w:t xml:space="preserve">.</w:t>
       </w:r>
     </w:p>
-    <w:bookmarkEnd w:id="82"/>
-    <w:bookmarkStart w:id="83" w:name="X1e2fd88383e755b0de637aee195156b89c1ce1f"/>
+    <w:bookmarkEnd w:id="85"/>
+    <w:bookmarkStart w:id="86" w:name="X1e2fd88383e755b0de637aee195156b89c1ce1f"/>
     <w:p>
       <w:pPr>
         <w:pStyle w:val="Heading3"/>
@@ -30213,8 +30331,8 @@
         <w:t xml:space="preserve">Test: walk the six security evidence items.</w:t>
       </w:r>
     </w:p>
-    <w:bookmarkEnd w:id="83"/>
-    <w:bookmarkStart w:id="84" w:name="results-to-fill-at-the-review"/>
+    <w:bookmarkEnd w:id="86"/>
+    <w:bookmarkStart w:id="87" w:name="results-to-fill-at-the-review"/>
     <w:p>
       <w:pPr>
         <w:pStyle w:val="Heading3"/>
@@ -31614,8 +31732,8 @@
         </w:tc>
       </w:tr>
     </w:tbl>
-    <w:bookmarkEnd w:id="84"/>
-    <w:bookmarkStart w:id="85" w:name="X287556ff213a075cc8fd7080e3c9e6c505480ef"/>
+    <w:bookmarkEnd w:id="87"/>
+    <w:bookmarkStart w:id="88" w:name="X287556ff213a075cc8fd7080e3c9e6c505480ef"/>
     <w:p>
       <w:pPr>
         <w:pStyle w:val="Heading3"/>
@@ -31779,8 +31897,8 @@
         <w:t xml:space="preserve">Which relative-gap cutoff to ratify, now that the 3,000-student sensitivity table exists (§3.9 item 2), and whether the priority groups are the right way to present the result.</w:t>
       </w:r>
     </w:p>
-    <w:bookmarkEnd w:id="85"/>
-    <w:bookmarkStart w:id="86" w:name="X9aee30a62998ef6eea56a2dbe1dddce56da57e1"/>
+    <w:bookmarkEnd w:id="88"/>
+    <w:bookmarkStart w:id="89" w:name="X9aee30a62998ef6eea56a2dbe1dddce56da57e1"/>
     <w:p>
       <w:pPr>
         <w:pStyle w:val="Heading3"/>
@@ -31817,9 +31935,9 @@
         </w:pict>
       </w:r>
     </w:p>
-    <w:bookmarkEnd w:id="86"/>
-    <w:bookmarkEnd w:id="87"/>
-    <w:bookmarkStart w:id="93" w:name="future-work"/>
+    <w:bookmarkEnd w:id="89"/>
+    <w:bookmarkEnd w:id="90"/>
+    <w:bookmarkStart w:id="96" w:name="future-work"/>
     <w:p>
       <w:pPr>
         <w:pStyle w:val="Heading2"/>
@@ -31836,7 +31954,7 @@
         <w:t xml:space="preserve">This chapter records what was descoped, what was deferred, and the late suggestions, so the next team starts from decisions rather than from scratch. The pre-agreed descope order was quizzes → study strategies → learning plans, with the extraction → clustering → gap-detection spine non-negotiable. The spine was delivered.</w:t>
       </w:r>
     </w:p>
-    <w:bookmarkStart w:id="88" w:name="descoped"/>
+    <w:bookmarkStart w:id="91" w:name="descoped"/>
     <w:p>
       <w:pPr>
         <w:pStyle w:val="Heading3"/>
@@ -31978,8 +32096,8 @@
         <w:t xml:space="preserve">against planted-gap recall is still a two-hour task.</w:t>
       </w:r>
     </w:p>
-    <w:bookmarkEnd w:id="88"/>
-    <w:bookmarkStart w:id="89" w:name="deferred-with-the-reason"/>
+    <w:bookmarkEnd w:id="91"/>
+    <w:bookmarkStart w:id="92" w:name="deferred-with-the-reason"/>
     <w:p>
       <w:pPr>
         <w:pStyle w:val="Heading3"/>
@@ -32154,7 +32272,25 @@
         <w:t xml:space="preserve"> </w:t>
       </w:r>
       <w:r>
-        <w:t xml:space="preserve">Built on its own branch (§3.11): declared sequence, subject chain on the gap card, configurable band, basis label. What remains is the owner’s course map to put in</w:t>
+        <w:t xml:space="preserve">Built on its own branch (§3.11): declared sequence, subject chain on the gap card, configurable band, basis label. What remains, in order: filter</w:t>
+      </w:r>
+      <w:r>
+        <w:t xml:space="preserve"> </w:t>
+      </w:r>
+      <w:r>
+        <w:t xml:space="preserve">“</w:t>
+      </w:r>
+      <w:r>
+        <w:t xml:space="preserve">ahead</w:t>
+      </w:r>
+      <w:r>
+        <w:t xml:space="preserve">”</w:t>
+      </w:r>
+      <w:r>
+        <w:t xml:space="preserve"> </w:t>
+      </w:r>
+      <w:r>
+        <w:t xml:space="preserve">to the student’s own program (the Program column exists in the workbook and the catalogue; the loader drops it), which is what makes the chain readable on a large cohort (§3.11); the owner’s course map to put in</w:t>
       </w:r>
       <w:r>
         <w:t xml:space="preserve"> </w:t>
@@ -32169,7 +32305,7 @@
         <w:t xml:space="preserve"> </w:t>
       </w:r>
       <w:r>
-        <w:t xml:space="preserve">(FR-1.7, still a decision he holds), Moodle enrolments as the source of</w:t>
+        <w:t xml:space="preserve">(FR-1.7, still a decision he holds); Moodle enrolments as the source of</w:t>
       </w:r>
       <w:r>
         <w:t xml:space="preserve"> </w:t>
@@ -32187,7 +32323,7 @@
         <w:t xml:space="preserve"> </w:t>
       </w:r>
       <w:r>
-        <w:t xml:space="preserve">on the production path, and the gap co-occurrence graph the ticket’s epic once mentioned, which was never specified.</w:t>
+        <w:t xml:space="preserve">on the production path; and the gap co-occurrence graph the ticket’s epic once mentioned, which was never specified.</w:t>
       </w:r>
     </w:p>
     <w:p>
@@ -32261,8 +32397,8 @@
         <w:t xml:space="preserve">.</w:t>
       </w:r>
     </w:p>
-    <w:bookmarkEnd w:id="89"/>
-    <w:bookmarkStart w:id="90" w:name="Xf427bac91b6968ac6e593f247411bef1c9f7963"/>
+    <w:bookmarkEnd w:id="92"/>
+    <w:bookmarkStart w:id="93" w:name="Xf427bac91b6968ac6e593f247411bef1c9f7963"/>
     <w:p>
       <w:pPr>
         <w:pStyle w:val="Heading3"/>
@@ -32523,8 +32659,8 @@
         <w:t xml:space="preserve">A Moodle plugin exposing rubric fills as a web service (tender Option 3), which would remove the database credential from the production path entirely.</w:t>
       </w:r>
     </w:p>
-    <w:bookmarkEnd w:id="90"/>
-    <w:bookmarkStart w:id="91" w:name="production-outlook-from-the-tender"/>
+    <w:bookmarkEnd w:id="93"/>
+    <w:bookmarkStart w:id="94" w:name="production-outlook-from-the-tender"/>
     <w:p>
       <w:pPr>
         <w:pStyle w:val="Heading3"/>
@@ -32541,8 +32677,8 @@
         <w:t xml:space="preserve">Roughly $200 per month for a small managed instance; a maintenance allowance of about 40 hours per semester; LLM cost about $0.02 for 150 students × 3 subjects on the Anthropic path, so about $0.10 per 1,000 students per semester. The dominant cost of running LJA is people reviewing clusters and ratifying thresholds, not compute.</w:t>
       </w:r>
     </w:p>
-    <w:bookmarkEnd w:id="91"/>
-    <w:bookmarkStart w:id="92" w:name="decisions-the-project-owner-still-holds"/>
+    <w:bookmarkEnd w:id="94"/>
+    <w:bookmarkStart w:id="95" w:name="decisions-the-project-owner-still-holds"/>
     <w:p>
       <w:pPr>
         <w:pStyle w:val="Heading3"/>
@@ -32566,9 +32702,9 @@
         </w:pict>
       </w:r>
     </w:p>
-    <w:bookmarkEnd w:id="92"/>
-    <w:bookmarkEnd w:id="93"/>
-    <w:bookmarkStart w:id="94" w:name="appendix-a.-glossary"/>
+    <w:bookmarkEnd w:id="95"/>
+    <w:bookmarkEnd w:id="96"/>
+    <w:bookmarkStart w:id="97" w:name="appendix-a.-glossary"/>
     <w:p>
       <w:pPr>
         <w:pStyle w:val="Heading2"/>
@@ -33314,8 +33450,8 @@
         </w:tc>
       </w:tr>
     </w:tbl>
-    <w:bookmarkEnd w:id="94"/>
-    <w:bookmarkStart w:id="102" w:name="appendix-b.-metrics-reference"/>
+    <w:bookmarkEnd w:id="97"/>
+    <w:bookmarkStart w:id="105" w:name="appendix-b.-metrics-reference"/>
     <w:p>
       <w:pPr>
         <w:pStyle w:val="Heading2"/>
@@ -33505,7 +33641,7 @@
         <w:t xml:space="preserve">.</w:t>
       </w:r>
     </w:p>
-    <w:bookmarkStart w:id="95" w:name="b.1-summary"/>
+    <w:bookmarkStart w:id="98" w:name="b.1-summary"/>
     <w:p>
       <w:pPr>
         <w:pStyle w:val="Heading3"/>
@@ -34848,8 +34984,8 @@
         </w:tc>
       </w:tr>
     </w:tbl>
-    <w:bookmarkEnd w:id="95"/>
-    <w:bookmarkStart w:id="96" w:name="b.2-figures-supplied-in-the-workbook"/>
+    <w:bookmarkEnd w:id="98"/>
+    <w:bookmarkStart w:id="99" w:name="b.2-figures-supplied-in-the-workbook"/>
     <w:p>
       <w:pPr>
         <w:pStyle w:val="Heading3"/>
@@ -35350,8 +35486,8 @@
         <w:t xml:space="preserve">band is not the dashboard’s at-risk cohort, which is deliberately undefined (B.4).</w:t>
       </w:r>
     </w:p>
-    <w:bookmarkEnd w:id="96"/>
-    <w:bookmarkStart w:id="97" w:name="X9836b0525749b8ad958a8ed8698cc69b0381553"/>
+    <w:bookmarkEnd w:id="99"/>
+    <w:bookmarkStart w:id="100" w:name="X9836b0525749b8ad958a8ed8698cc69b0381553"/>
     <w:p>
       <w:pPr>
         <w:pStyle w:val="Heading3"/>
@@ -37177,8 +37313,8 @@
         <w:t xml:space="preserve">, which reports gap detection at cutoffs of −1.0, −1.5 and −2.0.</w:t>
       </w:r>
     </w:p>
-    <w:bookmarkEnd w:id="97"/>
-    <w:bookmarkStart w:id="98" w:name="X7393b5fb7aff42cf13eb130bf4662f4b3049d9b"/>
+    <w:bookmarkEnd w:id="100"/>
+    <w:bookmarkStart w:id="101" w:name="X7393b5fb7aff42cf13eb130bf4662f4b3049d9b"/>
     <w:p>
       <w:pPr>
         <w:pStyle w:val="Heading3"/>
@@ -38549,8 +38685,8 @@
         <w:t xml:space="preserve">(cohort chart). The number of (student, competency) rows in each classification, for the students in the cohort.</w:t>
       </w:r>
     </w:p>
-    <w:bookmarkEnd w:id="98"/>
-    <w:bookmarkStart w:id="99" w:name="b.5-outcome-quality-metrics"/>
+    <w:bookmarkEnd w:id="101"/>
+    <w:bookmarkStart w:id="102" w:name="b.5-outcome-quality-metrics"/>
     <w:p>
       <w:pPr>
         <w:pStyle w:val="Heading3"/>
@@ -39340,8 +39476,8 @@
         <w:t xml:space="preserve">: the same ±5-point band as B.4.</w:t>
       </w:r>
     </w:p>
-    <w:bookmarkEnd w:id="99"/>
-    <w:bookmarkStart w:id="100" w:name="X954c5dbeb8a80ac3dddf0c3ce2309c29100eeea"/>
+    <w:bookmarkEnd w:id="102"/>
+    <w:bookmarkStart w:id="103" w:name="X954c5dbeb8a80ac3dddf0c3ce2309c29100eeea"/>
     <w:p>
       <w:pPr>
         <w:pStyle w:val="Heading3"/>
@@ -39835,8 +39971,8 @@
         <w:t xml:space="preserve">Unplanted flags are not automatically false positives: every generated student has real variation between competencies, so a flag in their genuinely weakest competency is a correct detection of a gap nobody planted.</w:t>
       </w:r>
     </w:p>
-    <w:bookmarkEnd w:id="100"/>
-    <w:bookmarkStart w:id="101" w:name="X42a860e5d5d21b9b27139ed050e3d67e584c28d"/>
+    <w:bookmarkEnd w:id="103"/>
+    <w:bookmarkStart w:id="104" w:name="X42a860e5d5d21b9b27139ed050e3d67e584c28d"/>
     <w:p>
       <w:pPr>
         <w:pStyle w:val="Heading3"/>
@@ -40328,9 +40464,9 @@
         </w:tc>
       </w:tr>
     </w:tbl>
-    <w:bookmarkEnd w:id="101"/>
-    <w:bookmarkEnd w:id="102"/>
-    <w:bookmarkStart w:id="103" w:name="appendix-c.-source-documents"/>
+    <w:bookmarkEnd w:id="104"/>
+    <w:bookmarkEnd w:id="105"/>
+    <w:bookmarkStart w:id="106" w:name="appendix-c.-source-documents"/>
     <w:p>
       <w:pPr>
         <w:pStyle w:val="Heading2"/>
@@ -41351,8 +41487,8 @@
         </w:tc>
       </w:tr>
     </w:tbl>
-    <w:bookmarkEnd w:id="103"/>
-    <w:bookmarkStart w:id="104" w:name="appendix-d.-change-log"/>
+    <w:bookmarkEnd w:id="106"/>
+    <w:bookmarkStart w:id="107" w:name="appendix-d.-change-log"/>
     <w:p>
       <w:pPr>
         <w:pStyle w:val="Heading2"/>
@@ -41726,14 +41862,14 @@
               <w:jc w:val="left"/>
             </w:pPr>
             <w:r>
-              <w:t xml:space="preserve">IOLG-106 trajectory model: new §3.11, decision D19, story D12, configuration rows, repository map, debt items 7 and 8 resolved to configuration, §8.2 and Appendix B reconciled. Ships on the IOLG-106 branch.</w:t>
+              <w:t xml:space="preserve">IOLG-106 trajectory model: new §3.11 with Figure 5c and the unfiltered-ahead finding, decision D19, story D12, configuration rows, repository map, debt items 7 and 8 resolved to configuration, §8.2 and Appendix B reconciled. Ships on the IOLG-106 branch.</w:t>
             </w:r>
           </w:p>
         </w:tc>
       </w:tr>
     </w:tbl>
-    <w:bookmarkEnd w:id="104"/>
-    <w:bookmarkEnd w:id="105"/>
+    <w:bookmarkEnd w:id="107"/>
+    <w:bookmarkEnd w:id="108"/>
     <w:sectPr/>
   </w:body>
 </w:document>

</xml_diff>